<commit_message>
doc(Rapport): Remplissage de certaines sections
[52][WIP]
Les sections qui ont été ajoutés sont:
L'introduction (1)
La planification de toutes les tâches à réaliser (2.2)
</commit_message>
<xml_diff>
--- a/doc/R-P_Web294-Rapport.docx
+++ b/doc/R-P_Web294-Rapport.docx
@@ -182,7 +182,7 @@
         </w:rPr>
         <w:fldChar w:fldCharType="separate"/>
       </w:r>
-      <w:hyperlink w:anchor="_Toc223445179" w:history="1">
+      <w:hyperlink w:anchor="_Toc223450323" w:history="1">
         <w:r>
           <w:rPr>
             <w:rStyle w:val="Lienhypertexte"/>
@@ -230,7 +230,7 @@
             <w:noProof/>
             <w:webHidden/>
           </w:rPr>
-          <w:instrText xml:space="preserve"> PAGEREF _Toc223445179 \h </w:instrText>
+          <w:instrText xml:space="preserve"> PAGEREF _Toc223450323 \h </w:instrText>
         </w:r>
         <w:r>
           <w:rPr>
@@ -280,7 +280,7 @@
           <w14:ligatures w14:val="standardContextual"/>
         </w:rPr>
       </w:pPr>
-      <w:hyperlink w:anchor="_Toc223445180" w:history="1">
+      <w:hyperlink w:anchor="_Toc223450324" w:history="1">
         <w:r>
           <w:rPr>
             <w:rStyle w:val="Lienhypertexte"/>
@@ -328,7 +328,7 @@
             <w:noProof/>
             <w:webHidden/>
           </w:rPr>
-          <w:instrText xml:space="preserve"> PAGEREF _Toc223445180 \h </w:instrText>
+          <w:instrText xml:space="preserve"> PAGEREF _Toc223450324 \h </w:instrText>
         </w:r>
         <w:r>
           <w:rPr>
@@ -348,7 +348,7 @@
             <w:noProof/>
             <w:webHidden/>
           </w:rPr>
-          <w:t>3</w:t>
+          <w:t>4</w:t>
         </w:r>
         <w:r>
           <w:rPr>
@@ -376,7 +376,7 @@
           <w14:ligatures w14:val="standardContextual"/>
         </w:rPr>
       </w:pPr>
-      <w:hyperlink w:anchor="_Toc223445181" w:history="1">
+      <w:hyperlink w:anchor="_Toc223450325" w:history="1">
         <w:r>
           <w:rPr>
             <w:rStyle w:val="Lienhypertexte"/>
@@ -422,7 +422,7 @@
             <w:noProof/>
             <w:webHidden/>
           </w:rPr>
-          <w:instrText xml:space="preserve"> PAGEREF _Toc223445181 \h </w:instrText>
+          <w:instrText xml:space="preserve"> PAGEREF _Toc223450325 \h </w:instrText>
         </w:r>
         <w:r>
           <w:rPr>
@@ -442,7 +442,7 @@
             <w:noProof/>
             <w:webHidden/>
           </w:rPr>
-          <w:t>3</w:t>
+          <w:t>4</w:t>
         </w:r>
         <w:r>
           <w:rPr>
@@ -470,7 +470,7 @@
           <w14:ligatures w14:val="standardContextual"/>
         </w:rPr>
       </w:pPr>
-      <w:hyperlink w:anchor="_Toc223445182" w:history="1">
+      <w:hyperlink w:anchor="_Toc223450326" w:history="1">
         <w:r>
           <w:rPr>
             <w:rStyle w:val="Lienhypertexte"/>
@@ -516,7 +516,7 @@
             <w:noProof/>
             <w:webHidden/>
           </w:rPr>
-          <w:instrText xml:space="preserve"> PAGEREF _Toc223445182 \h </w:instrText>
+          <w:instrText xml:space="preserve"> PAGEREF _Toc223450326 \h </w:instrText>
         </w:r>
         <w:r>
           <w:rPr>
@@ -536,7 +536,7 @@
             <w:noProof/>
             <w:webHidden/>
           </w:rPr>
-          <w:t>3</w:t>
+          <w:t>4</w:t>
         </w:r>
         <w:r>
           <w:rPr>
@@ -564,7 +564,7 @@
           <w14:ligatures w14:val="standardContextual"/>
         </w:rPr>
       </w:pPr>
-      <w:hyperlink w:anchor="_Toc223445183" w:history="1">
+      <w:hyperlink w:anchor="_Toc223450327" w:history="1">
         <w:r>
           <w:rPr>
             <w:rStyle w:val="Lienhypertexte"/>
@@ -610,7 +610,7 @@
             <w:noProof/>
             <w:webHidden/>
           </w:rPr>
-          <w:instrText xml:space="preserve"> PAGEREF _Toc223445183 \h </w:instrText>
+          <w:instrText xml:space="preserve"> PAGEREF _Toc223450327 \h </w:instrText>
         </w:r>
         <w:r>
           <w:rPr>
@@ -630,7 +630,7 @@
             <w:noProof/>
             <w:webHidden/>
           </w:rPr>
-          <w:t>3</w:t>
+          <w:t>5</w:t>
         </w:r>
         <w:r>
           <w:rPr>
@@ -660,7 +660,7 @@
           <w14:ligatures w14:val="standardContextual"/>
         </w:rPr>
       </w:pPr>
-      <w:hyperlink w:anchor="_Toc223445184" w:history="1">
+      <w:hyperlink w:anchor="_Toc223450328" w:history="1">
         <w:r>
           <w:rPr>
             <w:rStyle w:val="Lienhypertexte"/>
@@ -708,7 +708,7 @@
             <w:noProof/>
             <w:webHidden/>
           </w:rPr>
-          <w:instrText xml:space="preserve"> PAGEREF _Toc223445184 \h </w:instrText>
+          <w:instrText xml:space="preserve"> PAGEREF _Toc223450328 \h </w:instrText>
         </w:r>
         <w:r>
           <w:rPr>
@@ -728,7 +728,7 @@
             <w:noProof/>
             <w:webHidden/>
           </w:rPr>
-          <w:t>3</w:t>
+          <w:t>5</w:t>
         </w:r>
         <w:r>
           <w:rPr>
@@ -756,7 +756,7 @@
           <w14:ligatures w14:val="standardContextual"/>
         </w:rPr>
       </w:pPr>
-      <w:hyperlink w:anchor="_Toc223445185" w:history="1">
+      <w:hyperlink w:anchor="_Toc223450329" w:history="1">
         <w:r>
           <w:rPr>
             <w:rStyle w:val="Lienhypertexte"/>
@@ -802,7 +802,7 @@
             <w:noProof/>
             <w:webHidden/>
           </w:rPr>
-          <w:instrText xml:space="preserve"> PAGEREF _Toc223445185 \h </w:instrText>
+          <w:instrText xml:space="preserve"> PAGEREF _Toc223450329 \h </w:instrText>
         </w:r>
         <w:r>
           <w:rPr>
@@ -822,7 +822,7 @@
             <w:noProof/>
             <w:webHidden/>
           </w:rPr>
-          <w:t>3</w:t>
+          <w:t>5</w:t>
         </w:r>
         <w:r>
           <w:rPr>
@@ -850,7 +850,7 @@
           <w14:ligatures w14:val="standardContextual"/>
         </w:rPr>
       </w:pPr>
-      <w:hyperlink w:anchor="_Toc223445186" w:history="1">
+      <w:hyperlink w:anchor="_Toc223450330" w:history="1">
         <w:r>
           <w:rPr>
             <w:rStyle w:val="Lienhypertexte"/>
@@ -896,7 +896,7 @@
             <w:noProof/>
             <w:webHidden/>
           </w:rPr>
-          <w:instrText xml:space="preserve"> PAGEREF _Toc223445186 \h </w:instrText>
+          <w:instrText xml:space="preserve"> PAGEREF _Toc223450330 \h </w:instrText>
         </w:r>
         <w:r>
           <w:rPr>
@@ -916,7 +916,7 @@
             <w:noProof/>
             <w:webHidden/>
           </w:rPr>
-          <w:t>3</w:t>
+          <w:t>5</w:t>
         </w:r>
         <w:r>
           <w:rPr>
@@ -946,7 +946,7 @@
           <w14:ligatures w14:val="standardContextual"/>
         </w:rPr>
       </w:pPr>
-      <w:hyperlink w:anchor="_Toc223445187" w:history="1">
+      <w:hyperlink w:anchor="_Toc223450331" w:history="1">
         <w:r>
           <w:rPr>
             <w:rStyle w:val="Lienhypertexte"/>
@@ -994,7 +994,7 @@
             <w:noProof/>
             <w:webHidden/>
           </w:rPr>
-          <w:instrText xml:space="preserve"> PAGEREF _Toc223445187 \h </w:instrText>
+          <w:instrText xml:space="preserve"> PAGEREF _Toc223450331 \h </w:instrText>
         </w:r>
         <w:r>
           <w:rPr>
@@ -1014,7 +1014,7 @@
             <w:noProof/>
             <w:webHidden/>
           </w:rPr>
-          <w:t>3</w:t>
+          <w:t>5</w:t>
         </w:r>
         <w:r>
           <w:rPr>
@@ -1042,7 +1042,7 @@
           <w14:ligatures w14:val="standardContextual"/>
         </w:rPr>
       </w:pPr>
-      <w:hyperlink w:anchor="_Toc223445188" w:history="1">
+      <w:hyperlink w:anchor="_Toc223450332" w:history="1">
         <w:r>
           <w:rPr>
             <w:rStyle w:val="Lienhypertexte"/>
@@ -1088,7 +1088,7 @@
             <w:noProof/>
             <w:webHidden/>
           </w:rPr>
-          <w:instrText xml:space="preserve"> PAGEREF _Toc223445188 \h </w:instrText>
+          <w:instrText xml:space="preserve"> PAGEREF _Toc223450332 \h </w:instrText>
         </w:r>
         <w:r>
           <w:rPr>
@@ -1108,7 +1108,7 @@
             <w:noProof/>
             <w:webHidden/>
           </w:rPr>
-          <w:t>3</w:t>
+          <w:t>5</w:t>
         </w:r>
         <w:r>
           <w:rPr>
@@ -1136,7 +1136,7 @@
           <w14:ligatures w14:val="standardContextual"/>
         </w:rPr>
       </w:pPr>
-      <w:hyperlink w:anchor="_Toc223445189" w:history="1">
+      <w:hyperlink w:anchor="_Toc223450333" w:history="1">
         <w:r>
           <w:rPr>
             <w:rStyle w:val="Lienhypertexte"/>
@@ -1182,7 +1182,7 @@
             <w:noProof/>
             <w:webHidden/>
           </w:rPr>
-          <w:instrText xml:space="preserve"> PAGEREF _Toc223445189 \h </w:instrText>
+          <w:instrText xml:space="preserve"> PAGEREF _Toc223450333 \h </w:instrText>
         </w:r>
         <w:r>
           <w:rPr>
@@ -1202,7 +1202,7 @@
             <w:noProof/>
             <w:webHidden/>
           </w:rPr>
-          <w:t>3</w:t>
+          <w:t>5</w:t>
         </w:r>
         <w:r>
           <w:rPr>
@@ -1230,7 +1230,7 @@
           <w14:ligatures w14:val="standardContextual"/>
         </w:rPr>
       </w:pPr>
-      <w:hyperlink w:anchor="_Toc223445190" w:history="1">
+      <w:hyperlink w:anchor="_Toc223450334" w:history="1">
         <w:r>
           <w:rPr>
             <w:rStyle w:val="Lienhypertexte"/>
@@ -1276,7 +1276,7 @@
             <w:noProof/>
             <w:webHidden/>
           </w:rPr>
-          <w:instrText xml:space="preserve"> PAGEREF _Toc223445190 \h </w:instrText>
+          <w:instrText xml:space="preserve"> PAGEREF _Toc223450334 \h </w:instrText>
         </w:r>
         <w:r>
           <w:rPr>
@@ -1296,7 +1296,7 @@
             <w:noProof/>
             <w:webHidden/>
           </w:rPr>
-          <w:t>3</w:t>
+          <w:t>5</w:t>
         </w:r>
         <w:r>
           <w:rPr>
@@ -1326,7 +1326,7 @@
           <w14:ligatures w14:val="standardContextual"/>
         </w:rPr>
       </w:pPr>
-      <w:hyperlink w:anchor="_Toc223445191" w:history="1">
+      <w:hyperlink w:anchor="_Toc223450335" w:history="1">
         <w:r>
           <w:rPr>
             <w:rStyle w:val="Lienhypertexte"/>
@@ -1374,7 +1374,7 @@
             <w:noProof/>
             <w:webHidden/>
           </w:rPr>
-          <w:instrText xml:space="preserve"> PAGEREF _Toc223445191 \h </w:instrText>
+          <w:instrText xml:space="preserve"> PAGEREF _Toc223450335 \h </w:instrText>
         </w:r>
         <w:r>
           <w:rPr>
@@ -1394,7 +1394,7 @@
             <w:noProof/>
             <w:webHidden/>
           </w:rPr>
-          <w:t>3</w:t>
+          <w:t>5</w:t>
         </w:r>
         <w:r>
           <w:rPr>
@@ -1423,7 +1423,7 @@
       <w:pPr>
         <w:pStyle w:val="Titre1"/>
       </w:pPr>
-      <w:bookmarkStart w:id="0" w:name="_Toc223445179"/>
+      <w:bookmarkStart w:id="0" w:name="_Toc223450323"/>
       <w:r>
         <w:lastRenderedPageBreak/>
         <w:t>Introduction</w:t>
@@ -1433,22 +1433,73 @@
     <w:p>
       <w:pPr>
         <w:pStyle w:val="Corpsdetexte"/>
-      </w:pPr>
+        <w:jc w:val="left"/>
+      </w:pPr>
+      <w:r>
+        <w:t>Dans le cadre du module 294, il nous a été demandé de mettre en pratique les compétences acquises en développant le frontend d'une application web complète. Le projet « Passion Lecture » est un projet qui a pour objectif de créer une plateforme permettant aux utilisateurs de partager et de découvrir des ouvrages littéraires. Cette application a été développée selon une approche moderne et intuitive, avec l'utilisation de Vue.js et Vue Routeur pour l'interface. Le volet des données est géré par My</w:t>
+      </w:r>
+      <w:r>
+        <w:t>J</w:t>
+      </w:r>
+      <w:r>
+        <w:t>SON</w:t>
+      </w:r>
+      <w:r>
+        <w:t>S</w:t>
+      </w:r>
+      <w:r>
+        <w:t xml:space="preserve">erver, qui assure le rôle de </w:t>
+      </w:r>
+      <w:r>
+        <w:t>backend</w:t>
+      </w:r>
+      <w:r>
+        <w:t xml:space="preserve"> fictif, offrant une API REST fonctionnelle.</w:t>
+      </w:r>
     </w:p>
     <w:p>
       <w:pPr>
         <w:pStyle w:val="Corpsdetexte"/>
+        <w:jc w:val="left"/>
       </w:pPr>
     </w:p>
     <w:p>
       <w:pPr>
-        <w:pStyle w:val="Titre1"/>
-      </w:pPr>
+        <w:pStyle w:val="Corpsdetexte"/>
+        <w:jc w:val="left"/>
+      </w:pPr>
+      <w:r>
+        <w:t>Le site doit offrir plusieurs fonctionnalités essentielles, telles que la consultation des livres, leur ajout, leur modification ou leur suppression, ainsi que la possibilité de laisser des appréciations et des commentaires. Pour garantir la réussite de ce projet, une attention particulière est portée à la réalisation des maquettes, à la structuration du code, à l'utilisation des outils de version (GitHub avec GitHub Desktop), ainsi qu'à la production d'une documentation claire et professionnelle.</w:t>
+      </w:r>
+    </w:p>
+    <w:p>
+      <w:pPr>
+        <w:pStyle w:val="Corpsdetexte"/>
+        <w:jc w:val="left"/>
+      </w:pPr>
+    </w:p>
+    <w:p>
+      <w:pPr>
+        <w:pStyle w:val="Corpsdetexte"/>
+        <w:jc w:val="left"/>
+      </w:pPr>
+      <w:r>
+        <w:t>Ce projet représente une opportunité unique de développer une application exploitable et soignée, tout en suivant une démarche complète allant de l'analyse à la réalisation. Il favorise également le renforcement de la collaboration au sein du groupe, l'apprentissage de la gestion d'une planification réaliste et la compréhension des bonnes pratiques indispensables au développement web moderne.</w:t>
+      </w:r>
       <w:bookmarkStart w:id="1" w:name="_Toc532179957"/>
       <w:bookmarkStart w:id="2" w:name="_Toc165969641"/>
       <w:bookmarkStart w:id="3" w:name="_Toc308526332"/>
-      <w:bookmarkStart w:id="4" w:name="_Toc223445180"/>
       <w:r>
+        <w:br w:type="page"/>
+      </w:r>
+    </w:p>
+    <w:p>
+      <w:pPr>
+        <w:pStyle w:val="Titre1"/>
+      </w:pPr>
+      <w:bookmarkStart w:id="4" w:name="_Toc223450324"/>
+      <w:r>
+        <w:lastRenderedPageBreak/>
         <w:t>Analyse</w:t>
       </w:r>
       <w:bookmarkEnd w:id="1"/>
@@ -1460,7 +1511,7 @@
       <w:pPr>
         <w:pStyle w:val="Titre2"/>
       </w:pPr>
-      <w:bookmarkStart w:id="5" w:name="_Toc223445181"/>
+      <w:bookmarkStart w:id="5" w:name="_Toc223450325"/>
       <w:r>
         <w:t>Présentation des maquettes</w:t>
       </w:r>
@@ -1469,7 +1520,28 @@
     <w:p>
       <w:pPr>
         <w:pStyle w:val="Retraitcorpsdetexte"/>
-      </w:pPr>
+        <w:jc w:val="left"/>
+      </w:pPr>
+      <w:r>
+        <w:t>Ici, il faudra ajouter toutes les maquettes (</w:t>
+      </w:r>
+      <w:proofErr w:type="spellStart"/>
+      <w:r>
+        <w:t>mockups</w:t>
+      </w:r>
+      <w:proofErr w:type="spellEnd"/>
+      <w:r>
+        <w:t xml:space="preserve">) en photo, ainsi que </w:t>
+      </w:r>
+      <w:r>
+        <w:t>3</w:t>
+      </w:r>
+      <w:r>
+        <w:t xml:space="preserve"> à </w:t>
+      </w:r>
+      <w:r>
+        <w:t>4 lignes par maquettes</w:t>
+      </w:r>
     </w:p>
     <w:p>
       <w:pPr>
@@ -1480,7 +1552,7 @@
       <w:pPr>
         <w:pStyle w:val="Titre2"/>
       </w:pPr>
-      <w:bookmarkStart w:id="6" w:name="_Toc223445182"/>
+      <w:bookmarkStart w:id="6" w:name="_Toc223450326"/>
       <w:r>
         <w:t>Planification de toutes les tâches à réaliser</w:t>
       </w:r>
@@ -1489,19 +1561,185 @@
     <w:p>
       <w:pPr>
         <w:pStyle w:val="Retraitcorpsdetexte"/>
-      </w:pPr>
+        <w:jc w:val="left"/>
+      </w:pPr>
+      <w:r>
+        <w:t>La planification du projet est une étape clé pour garantir une progression structurée et cohérente de l'ensemble des travaux. Étant donné la portée du projet et le nombre de fonctionnalités à mettre en place, il est indispensable d'organiser précisément les tâches, de les répartir dans le temps et de garantir une visibilité claire sur l'avancement grâce à GitHub Project.</w:t>
+      </w:r>
     </w:p>
     <w:p>
       <w:pPr>
         <w:pStyle w:val="Retraitcorpsdetexte"/>
+        <w:jc w:val="left"/>
       </w:pPr>
     </w:p>
     <w:p>
       <w:pPr>
+        <w:pStyle w:val="Retraitcorpsdetexte"/>
+        <w:jc w:val="left"/>
+      </w:pPr>
+      <w:r>
+        <w:t xml:space="preserve">Dans un premier temps, nous avons commencé par analyser attentivement le cahier des charges afin d’identifier l’ensemble des livrables attendus. </w:t>
+      </w:r>
+      <w:r>
+        <w:t>Cette analyse nous a permis de créer plusieurs tâches, telles que la conception des maquettes, la préparation de l'environnement de développement, la rédaction de la documentation, et autres tâches. Chaque grande catégorie a ensuite été déclinée en sous-tâches plus spécifiques, permettant un suivi plus précis et une organisation méthodique du travail.</w:t>
+      </w:r>
+    </w:p>
+    <w:p>
+      <w:pPr>
+        <w:pStyle w:val="Retraitcorpsdetexte"/>
+      </w:pPr>
+    </w:p>
+    <w:p>
+      <w:pPr>
+        <w:pStyle w:val="Retraitcorpsdetexte"/>
+        <w:jc w:val="left"/>
+      </w:pPr>
+      <w:r>
+        <w:t>Les principales tâches planifiées sont les suivantes :</w:t>
+      </w:r>
+    </w:p>
+    <w:p>
+      <w:pPr>
+        <w:pStyle w:val="Retraitcorpsdetexte"/>
+        <w:numPr>
+          <w:ilvl w:val="0"/>
+          <w:numId w:val="48"/>
+        </w:numPr>
+        <w:jc w:val="left"/>
+      </w:pPr>
+      <w:r>
+        <w:t xml:space="preserve">Création </w:t>
+      </w:r>
+      <w:r>
+        <w:t>des maquettes</w:t>
+      </w:r>
+    </w:p>
+    <w:p>
+      <w:pPr>
+        <w:pStyle w:val="Retraitcorpsdetexte"/>
+        <w:ind w:left="1494"/>
+        <w:jc w:val="left"/>
+      </w:pPr>
+      <w:r>
+        <w:t>Réalisation des vues principales (Accueil, galerie, mes livres, ajouter un livre, etc.</w:t>
+      </w:r>
+    </w:p>
+    <w:p>
+      <w:pPr>
+        <w:pStyle w:val="Retraitcorpsdetexte"/>
+        <w:numPr>
+          <w:ilvl w:val="0"/>
+          <w:numId w:val="48"/>
+        </w:numPr>
+        <w:jc w:val="left"/>
+      </w:pPr>
+      <w:r>
+        <w:t>Initialisation du projet</w:t>
+      </w:r>
+    </w:p>
+    <w:p>
+      <w:pPr>
+        <w:pStyle w:val="Retraitcorpsdetexte"/>
+        <w:ind w:left="1494"/>
+        <w:jc w:val="left"/>
+      </w:pPr>
+      <w:r>
+        <w:t>Préparation du projet Vue.js, installation des dépendances, effacer le non-nécessaire</w:t>
+      </w:r>
+    </w:p>
+    <w:p>
+      <w:pPr>
+        <w:pStyle w:val="Retraitcorpsdetexte"/>
+        <w:numPr>
+          <w:ilvl w:val="0"/>
+          <w:numId w:val="48"/>
+        </w:numPr>
+        <w:jc w:val="left"/>
+      </w:pPr>
+      <w:r>
+        <w:t>Initialisation du Vue Routeur</w:t>
+      </w:r>
+    </w:p>
+    <w:p>
+      <w:pPr>
+        <w:pStyle w:val="Retraitcorpsdetexte"/>
+        <w:ind w:left="1494"/>
+        <w:jc w:val="left"/>
+      </w:pPr>
+      <w:r>
+        <w:t xml:space="preserve">Définition des routes, ajout des paramètres requis </w:t>
+      </w:r>
+      <w:r>
+        <w:t>et utilisation des routes</w:t>
+      </w:r>
+    </w:p>
+    <w:p>
+      <w:pPr>
+        <w:pStyle w:val="Retraitcorpsdetexte"/>
+        <w:numPr>
+          <w:ilvl w:val="0"/>
+          <w:numId w:val="48"/>
+        </w:numPr>
+        <w:jc w:val="left"/>
+      </w:pPr>
+      <w:r>
+        <w:t>Développement des fonctionnalités (plusieurs tâches)</w:t>
+      </w:r>
+    </w:p>
+    <w:p>
+      <w:pPr>
+        <w:pStyle w:val="Retraitcorpsdetexte"/>
+        <w:ind w:left="1494"/>
+        <w:jc w:val="left"/>
+      </w:pPr>
+      <w:r>
+        <w:t>Gestion des livres, gestion des commentaires (pas de gestion d’utilisateur)</w:t>
+      </w:r>
+    </w:p>
+    <w:p>
+      <w:pPr>
+        <w:pStyle w:val="Retraitcorpsdetexte"/>
+        <w:numPr>
+          <w:ilvl w:val="0"/>
+          <w:numId w:val="48"/>
+        </w:numPr>
+        <w:jc w:val="left"/>
+      </w:pPr>
+      <w:r>
+        <w:t>Documentation</w:t>
+      </w:r>
+    </w:p>
+    <w:p>
+      <w:pPr>
+        <w:pStyle w:val="Retraitcorpsdetexte"/>
+        <w:ind w:left="1494"/>
+        <w:jc w:val="left"/>
+      </w:pPr>
+      <w:r>
+        <w:t>Tout documenter dans ce rapport</w:t>
+      </w:r>
+    </w:p>
+    <w:p>
+      <w:pPr>
+        <w:pStyle w:val="Retraitcorpsdetexte"/>
+        <w:numPr>
+          <w:ilvl w:val="0"/>
+          <w:numId w:val="48"/>
+        </w:numPr>
+        <w:jc w:val="left"/>
+      </w:pPr>
+      <w:r>
+        <w:t>Test et validation : vérification fonctionnelle et corrections des dernières anomalies</w:t>
+      </w:r>
+    </w:p>
+    <w:p>
+      <w:pPr>
         <w:pStyle w:val="Titre2"/>
       </w:pPr>
-      <w:bookmarkStart w:id="7" w:name="_Toc223445183"/>
+      <w:bookmarkStart w:id="7" w:name="_Toc223450327"/>
       <w:r>
+        <w:lastRenderedPageBreak/>
         <w:t>Organisation du code</w:t>
       </w:r>
       <w:bookmarkEnd w:id="7"/>
@@ -1523,7 +1761,7 @@
       <w:pPr>
         <w:pStyle w:val="Titre1"/>
       </w:pPr>
-      <w:bookmarkStart w:id="11" w:name="_Toc223445184"/>
+      <w:bookmarkStart w:id="11" w:name="_Toc223450328"/>
       <w:r>
         <w:t>Réalisation</w:t>
       </w:r>
@@ -1539,7 +1777,7 @@
       <w:bookmarkStart w:id="12" w:name="_Toc532179960"/>
       <w:bookmarkStart w:id="13" w:name="_Toc165969644"/>
       <w:bookmarkStart w:id="14" w:name="_Toc308526339"/>
-      <w:bookmarkStart w:id="15" w:name="_Toc223445185"/>
+      <w:bookmarkStart w:id="15" w:name="_Toc223450329"/>
       <w:r>
         <w:t>Fonctionnalités technique demandées</w:t>
       </w:r>
@@ -1559,7 +1797,7 @@
       <w:pPr>
         <w:pStyle w:val="Titre2"/>
       </w:pPr>
-      <w:bookmarkStart w:id="16" w:name="_Toc223445186"/>
+      <w:bookmarkStart w:id="16" w:name="_Toc223450330"/>
       <w:bookmarkEnd w:id="12"/>
       <w:bookmarkEnd w:id="13"/>
       <w:bookmarkEnd w:id="14"/>
@@ -1589,7 +1827,7 @@
       </w:pPr>
       <w:bookmarkStart w:id="17" w:name="_Toc165969653"/>
       <w:bookmarkStart w:id="18" w:name="_Toc308526342"/>
-      <w:bookmarkStart w:id="19" w:name="_Toc223445187"/>
+      <w:bookmarkStart w:id="19" w:name="_Toc223450331"/>
       <w:r>
         <w:t>Conclusion</w:t>
       </w:r>
@@ -1601,7 +1839,7 @@
       <w:pPr>
         <w:pStyle w:val="Titre2"/>
       </w:pPr>
-      <w:bookmarkStart w:id="20" w:name="_Toc223445188"/>
+      <w:bookmarkStart w:id="20" w:name="_Toc223450332"/>
       <w:r>
         <w:t>Conclusion générale</w:t>
       </w:r>
@@ -1621,7 +1859,7 @@
       <w:pPr>
         <w:pStyle w:val="Titre2"/>
       </w:pPr>
-      <w:bookmarkStart w:id="21" w:name="_Toc223445189"/>
+      <w:bookmarkStart w:id="21" w:name="_Toc223450333"/>
       <w:r>
         <w:t>Conclusion personnelle</w:t>
       </w:r>
@@ -1641,7 +1879,7 @@
       <w:pPr>
         <w:pStyle w:val="Titre2"/>
       </w:pPr>
-      <w:bookmarkStart w:id="22" w:name="_Toc223445190"/>
+      <w:bookmarkStart w:id="22" w:name="_Toc223450334"/>
       <w:r>
         <w:t>Critique(s) constructive</w:t>
       </w:r>
@@ -1661,7 +1899,7 @@
       <w:pPr>
         <w:pStyle w:val="Titre1"/>
       </w:pPr>
-      <w:bookmarkStart w:id="23" w:name="_Toc223445191"/>
+      <w:bookmarkStart w:id="23" w:name="_Toc223450335"/>
       <w:r>
         <w:t>Webographie / bibliographie / glossaire</w:t>
       </w:r>
@@ -1670,23 +1908,101 @@
     <w:p>
       <w:pPr>
         <w:pStyle w:val="Corpsdetexte"/>
-      </w:pPr>
+        <w:numPr>
+          <w:ilvl w:val="0"/>
+          <w:numId w:val="48"/>
+        </w:numPr>
+      </w:pPr>
+      <w:hyperlink r:id="rId12" w:history="1">
+        <w:r>
+          <w:rPr>
+            <w:rStyle w:val="Lienhypertexte"/>
+          </w:rPr>
+          <w:t>https://vuejs.org/</w:t>
+        </w:r>
+      </w:hyperlink>
     </w:p>
     <w:p>
       <w:pPr>
         <w:pStyle w:val="Corpsdetexte"/>
-        <w:tabs>
-          <w:tab w:val="clear" w:pos="4395"/>
-          <w:tab w:val="left" w:pos="1662"/>
-        </w:tabs>
-      </w:pPr>
-      <w:r>
-        <w:tab/>
-      </w:r>
+        <w:numPr>
+          <w:ilvl w:val="0"/>
+          <w:numId w:val="48"/>
+        </w:numPr>
+      </w:pPr>
+      <w:hyperlink r:id="rId13" w:history="1">
+        <w:r>
+          <w:rPr>
+            <w:rStyle w:val="Lienhypertexte"/>
+          </w:rPr>
+          <w:t>https://www.journaldunet.fr/developpeur/developpement/1441159-axios-concevoir-une-requete-post-pour-renvoyer-les-donnees-d-un-formulaire/</w:t>
+        </w:r>
+      </w:hyperlink>
+    </w:p>
+    <w:p>
+      <w:pPr>
+        <w:pStyle w:val="Corpsdetexte"/>
+        <w:numPr>
+          <w:ilvl w:val="0"/>
+          <w:numId w:val="48"/>
+        </w:numPr>
+      </w:pPr>
+      <w:hyperlink r:id="rId14" w:history="1">
+        <w:r>
+          <w:rPr>
+            <w:rStyle w:val="Lienhypertexte"/>
+          </w:rPr>
+          <w:t>https://developer.mozilla.org/</w:t>
+        </w:r>
+      </w:hyperlink>
+    </w:p>
+    <w:p>
+      <w:pPr>
+        <w:pStyle w:val="Corpsdetexte"/>
+        <w:numPr>
+          <w:ilvl w:val="0"/>
+          <w:numId w:val="48"/>
+        </w:numPr>
+        <w:rPr>
+          <w:rStyle w:val="Lienhypertexte"/>
+          <w:color w:val="auto"/>
+          <w:u w:val="none"/>
+        </w:rPr>
+      </w:pPr>
+      <w:hyperlink r:id="rId15" w:history="1">
+        <w:r>
+          <w:rPr>
+            <w:rStyle w:val="Lienhypertexte"/>
+          </w:rPr>
+          <w:t>https://www.w3schools.com/</w:t>
+        </w:r>
+      </w:hyperlink>
+    </w:p>
+    <w:p>
+      <w:pPr>
+        <w:pStyle w:val="Corpsdetexte"/>
+        <w:numPr>
+          <w:ilvl w:val="0"/>
+          <w:numId w:val="48"/>
+        </w:numPr>
+      </w:pPr>
+      <w:hyperlink r:id="rId16" w:history="1">
+        <w:r>
+          <w:rPr>
+            <w:rStyle w:val="Lienhypertexte"/>
+          </w:rPr>
+          <w:t>https://codelynx.dev/posts/sleep-javascript</w:t>
+        </w:r>
+      </w:hyperlink>
+    </w:p>
+    <w:p>
+      <w:pPr>
+        <w:pStyle w:val="Corpsdetexte"/>
+      </w:pPr>
     </w:p>
     <w:sectPr>
-      <w:headerReference w:type="default" r:id="rId12"/>
-      <w:footerReference w:type="default" r:id="rId13"/>
+      <w:headerReference w:type="default" r:id="rId17"/>
+      <w:footerReference w:type="default" r:id="rId18"/>
       <w:pgSz w:w="11906" w:h="16838" w:code="9"/>
       <w:pgMar w:top="1418" w:right="1418" w:bottom="1418" w:left="1418" w:header="709" w:footer="709" w:gutter="0"/>
       <w:cols w:space="708"/>
@@ -1722,7 +2038,6 @@
     <w:tblPr>
       <w:tblStyle w:val="Grilledutableau"/>
       <w:tblW w:w="5000" w:type="pct"/>
-      <w:jc w:val="center"/>
       <w:tblBorders>
         <w:left w:val="none" w:sz="0" w:space="0" w:color="auto"/>
         <w:bottom w:val="none" w:sz="0" w:space="0" w:color="auto"/>
@@ -1735,58 +2050,61 @@
     <w:tblGrid>
       <w:gridCol w:w="3428"/>
       <w:gridCol w:w="2612"/>
-      <w:gridCol w:w="3030"/>
+      <w:gridCol w:w="209"/>
+      <w:gridCol w:w="2821"/>
     </w:tblGrid>
     <w:tr>
       <w:trPr>
-        <w:trHeight w:hRule="exact" w:val="227"/>
-        <w:jc w:val="center"/>
+        <w:trHeight w:hRule="exact" w:val="292"/>
       </w:trPr>
       <w:tc>
         <w:tcPr>
-          <w:tcW w:w="3510" w:type="dxa"/>
+          <w:tcW w:w="3428" w:type="dxa"/>
           <w:vAlign w:val="center"/>
         </w:tcPr>
         <w:p>
           <w:pPr>
             <w:pStyle w:val="-Pieddepage"/>
+            <w:spacing w:line="240" w:lineRule="auto"/>
           </w:pPr>
           <w:r>
             <w:t>Auteur</w:t>
           </w:r>
           <w:r>
-            <w:rPr>
-              <w:rFonts w:cs="Arial"/>
-              <w:szCs w:val="16"/>
-            </w:rPr>
             <w:t> : Jonathan et Néo</w:t>
           </w:r>
         </w:p>
         <w:p>
           <w:pPr>
             <w:pStyle w:val="-Pieddepage"/>
+            <w:spacing w:line="240" w:lineRule="auto"/>
           </w:pPr>
         </w:p>
       </w:tc>
       <w:tc>
         <w:tcPr>
-          <w:tcW w:w="2680" w:type="dxa"/>
+          <w:tcW w:w="2612" w:type="dxa"/>
           <w:vAlign w:val="center"/>
         </w:tcPr>
         <w:p>
           <w:pPr>
             <w:pStyle w:val="-Pieddepage"/>
+            <w:spacing w:line="240" w:lineRule="auto"/>
+            <w:jc w:val="center"/>
           </w:pPr>
         </w:p>
       </w:tc>
       <w:tc>
         <w:tcPr>
-          <w:tcW w:w="3096" w:type="dxa"/>
+          <w:tcW w:w="3030" w:type="dxa"/>
+          <w:gridSpan w:val="2"/>
           <w:vAlign w:val="center"/>
         </w:tcPr>
         <w:p>
           <w:pPr>
             <w:pStyle w:val="-Pieddepage"/>
+            <w:spacing w:line="240" w:lineRule="auto"/>
+            <w:jc w:val="right"/>
           </w:pPr>
           <w:r>
             <w:t>Création</w:t>
@@ -1816,17 +2134,15 @@
       </w:tc>
     </w:tr>
     <w:tr>
-      <w:trPr>
-        <w:jc w:val="center"/>
-      </w:trPr>
       <w:tc>
         <w:tcPr>
-          <w:tcW w:w="3510" w:type="dxa"/>
+          <w:tcW w:w="3428" w:type="dxa"/>
           <w:vAlign w:val="center"/>
         </w:tcPr>
         <w:p>
           <w:pPr>
             <w:pStyle w:val="-Pieddepage"/>
+            <w:spacing w:line="240" w:lineRule="auto"/>
             <w:rPr>
               <w:rFonts w:cs="Arial"/>
               <w:szCs w:val="16"/>
@@ -1872,12 +2188,14 @@
       </w:tc>
       <w:tc>
         <w:tcPr>
-          <w:tcW w:w="2680" w:type="dxa"/>
+          <w:tcW w:w="2612" w:type="dxa"/>
           <w:vAlign w:val="center"/>
         </w:tcPr>
         <w:p>
           <w:pPr>
             <w:pStyle w:val="-Pieddepage"/>
+            <w:spacing w:line="240" w:lineRule="auto"/>
+            <w:jc w:val="center"/>
           </w:pPr>
           <w:r>
             <w:t xml:space="preserve">Page </w:t>
@@ -1976,12 +2294,15 @@
       </w:tc>
       <w:tc>
         <w:tcPr>
-          <w:tcW w:w="3096" w:type="dxa"/>
+          <w:tcW w:w="3030" w:type="dxa"/>
+          <w:gridSpan w:val="2"/>
           <w:vAlign w:val="center"/>
         </w:tcPr>
         <w:p>
           <w:pPr>
             <w:pStyle w:val="-Pieddepage"/>
+            <w:spacing w:line="240" w:lineRule="auto"/>
+            <w:jc w:val="right"/>
           </w:pPr>
           <w:r>
             <w:t>Impression</w:t>
@@ -2012,16 +2333,17 @@
     </w:tr>
     <w:tr>
       <w:trPr>
-        <w:jc w:val="center"/>
+        <w:trHeight w:val="183"/>
       </w:trPr>
       <w:tc>
         <w:tcPr>
-          <w:tcW w:w="3510" w:type="dxa"/>
+          <w:tcW w:w="3428" w:type="dxa"/>
           <w:vAlign w:val="center"/>
         </w:tcPr>
         <w:p>
           <w:pPr>
             <w:pStyle w:val="-Pieddepage"/>
+            <w:spacing w:line="240" w:lineRule="auto"/>
           </w:pPr>
           <w:r>
             <w:t>Version</w:t>
@@ -2037,7 +2359,7 @@
               <w:rPr>
                 <w:noProof/>
               </w:rPr>
-              <w:t>1</w:t>
+              <w:t>7</w:t>
             </w:r>
           </w:fldSimple>
           <w:r>
@@ -2056,7 +2378,7 @@
             <w:rPr>
               <w:noProof/>
             </w:rPr>
-            <w:t>03.03.2026 15:47</w:t>
+            <w:t>03.03.2026 17:19</w:t>
           </w:r>
           <w:r>
             <w:fldChar w:fldCharType="end"/>
@@ -2065,13 +2387,15 @@
       </w:tc>
       <w:tc>
         <w:tcPr>
-          <w:tcW w:w="5776" w:type="dxa"/>
+          <w:tcW w:w="2821" w:type="dxa"/>
           <w:gridSpan w:val="2"/>
           <w:vAlign w:val="center"/>
         </w:tcPr>
         <w:p>
           <w:pPr>
             <w:pStyle w:val="-Pieddepage"/>
+            <w:spacing w:line="240" w:lineRule="auto"/>
+            <w:jc w:val="center"/>
             <w:rPr>
               <w:rFonts w:cs="Arial"/>
               <w:szCs w:val="16"/>
@@ -2095,13 +2419,25 @@
           </w:fldSimple>
         </w:p>
       </w:tc>
+      <w:tc>
+        <w:tcPr>
+          <w:tcW w:w="2821" w:type="dxa"/>
+          <w:vAlign w:val="center"/>
+        </w:tcPr>
+        <w:p>
+          <w:pPr>
+            <w:pStyle w:val="-Pieddepage"/>
+            <w:spacing w:line="240" w:lineRule="auto"/>
+            <w:jc w:val="right"/>
+            <w:rPr>
+              <w:rFonts w:cs="Arial"/>
+              <w:szCs w:val="16"/>
+            </w:rPr>
+          </w:pPr>
+        </w:p>
+      </w:tc>
     </w:tr>
   </w:tbl>
-  <w:p>
-    <w:pPr>
-      <w:pStyle w:val="Pieddepage"/>
-    </w:pPr>
-  </w:p>
   <w:p/>
 </w:ftr>
 </file>
@@ -2265,7 +2601,7 @@
         <v:path o:extrusionok="f" gradientshapeok="t" o:connecttype="rect"/>
         <o:lock v:ext="edit" aspectratio="t"/>
       </v:shapetype>
-      <v:shape id="_x0000_i1122" type="#_x0000_t75" style="width:11.7pt;height:11.7pt" o:bullet="t">
+      <v:shape id="_x0000_i1067" type="#_x0000_t75" style="width:11.35pt;height:11.35pt" o:bullet="t">
         <v:imagedata r:id="rId1" o:title="BD10263_"/>
       </v:shape>
     </w:pict>
@@ -2569,6 +2905,119 @@
     </w:lvl>
   </w:abstractNum>
   <w:abstractNum w:abstractNumId="11" w15:restartNumberingAfterBreak="0">
+    <w:nsid w:val="006B3FB7"/>
+    <w:multiLevelType w:val="hybridMultilevel"/>
+    <w:tmpl w:val="C0006DE0"/>
+    <w:lvl w:ilvl="0" w:tplc="F0D8282E">
+      <w:start w:val="3"/>
+      <w:numFmt w:val="bullet"/>
+      <w:lvlText w:val=""/>
+      <w:lvlJc w:val="left"/>
+      <w:pPr>
+        <w:ind w:left="1494" w:hanging="360"/>
+      </w:pPr>
+      <w:rPr>
+        <w:rFonts w:ascii="Symbol" w:eastAsia="Aptos" w:hAnsi="Symbol" w:cs="Times New Roman" w:hint="default"/>
+      </w:rPr>
+    </w:lvl>
+    <w:lvl w:ilvl="1" w:tplc="100C0003" w:tentative="1">
+      <w:start w:val="1"/>
+      <w:numFmt w:val="bullet"/>
+      <w:lvlText w:val="o"/>
+      <w:lvlJc w:val="left"/>
+      <w:pPr>
+        <w:ind w:left="2214" w:hanging="360"/>
+      </w:pPr>
+      <w:rPr>
+        <w:rFonts w:ascii="Courier New" w:hAnsi="Courier New" w:cs="Courier New" w:hint="default"/>
+      </w:rPr>
+    </w:lvl>
+    <w:lvl w:ilvl="2" w:tplc="100C0005" w:tentative="1">
+      <w:start w:val="1"/>
+      <w:numFmt w:val="bullet"/>
+      <w:lvlText w:val=""/>
+      <w:lvlJc w:val="left"/>
+      <w:pPr>
+        <w:ind w:left="2934" w:hanging="360"/>
+      </w:pPr>
+      <w:rPr>
+        <w:rFonts w:ascii="Wingdings" w:hAnsi="Wingdings" w:hint="default"/>
+      </w:rPr>
+    </w:lvl>
+    <w:lvl w:ilvl="3" w:tplc="100C0001" w:tentative="1">
+      <w:start w:val="1"/>
+      <w:numFmt w:val="bullet"/>
+      <w:lvlText w:val=""/>
+      <w:lvlJc w:val="left"/>
+      <w:pPr>
+        <w:ind w:left="3654" w:hanging="360"/>
+      </w:pPr>
+      <w:rPr>
+        <w:rFonts w:ascii="Symbol" w:hAnsi="Symbol" w:hint="default"/>
+      </w:rPr>
+    </w:lvl>
+    <w:lvl w:ilvl="4" w:tplc="100C0003" w:tentative="1">
+      <w:start w:val="1"/>
+      <w:numFmt w:val="bullet"/>
+      <w:lvlText w:val="o"/>
+      <w:lvlJc w:val="left"/>
+      <w:pPr>
+        <w:ind w:left="4374" w:hanging="360"/>
+      </w:pPr>
+      <w:rPr>
+        <w:rFonts w:ascii="Courier New" w:hAnsi="Courier New" w:cs="Courier New" w:hint="default"/>
+      </w:rPr>
+    </w:lvl>
+    <w:lvl w:ilvl="5" w:tplc="100C0005" w:tentative="1">
+      <w:start w:val="1"/>
+      <w:numFmt w:val="bullet"/>
+      <w:lvlText w:val=""/>
+      <w:lvlJc w:val="left"/>
+      <w:pPr>
+        <w:ind w:left="5094" w:hanging="360"/>
+      </w:pPr>
+      <w:rPr>
+        <w:rFonts w:ascii="Wingdings" w:hAnsi="Wingdings" w:hint="default"/>
+      </w:rPr>
+    </w:lvl>
+    <w:lvl w:ilvl="6" w:tplc="100C0001" w:tentative="1">
+      <w:start w:val="1"/>
+      <w:numFmt w:val="bullet"/>
+      <w:lvlText w:val=""/>
+      <w:lvlJc w:val="left"/>
+      <w:pPr>
+        <w:ind w:left="5814" w:hanging="360"/>
+      </w:pPr>
+      <w:rPr>
+        <w:rFonts w:ascii="Symbol" w:hAnsi="Symbol" w:hint="default"/>
+      </w:rPr>
+    </w:lvl>
+    <w:lvl w:ilvl="7" w:tplc="100C0003" w:tentative="1">
+      <w:start w:val="1"/>
+      <w:numFmt w:val="bullet"/>
+      <w:lvlText w:val="o"/>
+      <w:lvlJc w:val="left"/>
+      <w:pPr>
+        <w:ind w:left="6534" w:hanging="360"/>
+      </w:pPr>
+      <w:rPr>
+        <w:rFonts w:ascii="Courier New" w:hAnsi="Courier New" w:cs="Courier New" w:hint="default"/>
+      </w:rPr>
+    </w:lvl>
+    <w:lvl w:ilvl="8" w:tplc="100C0005" w:tentative="1">
+      <w:start w:val="1"/>
+      <w:numFmt w:val="bullet"/>
+      <w:lvlText w:val=""/>
+      <w:lvlJc w:val="left"/>
+      <w:pPr>
+        <w:ind w:left="7254" w:hanging="360"/>
+      </w:pPr>
+      <w:rPr>
+        <w:rFonts w:ascii="Wingdings" w:hAnsi="Wingdings" w:hint="default"/>
+      </w:rPr>
+    </w:lvl>
+  </w:abstractNum>
+  <w:abstractNum w:abstractNumId="12" w15:restartNumberingAfterBreak="0">
     <w:nsid w:val="02202AAE"/>
     <w:multiLevelType w:val="multilevel"/>
     <w:tmpl w:val="C2ACEA3A"/>
@@ -2713,7 +3162,7 @@
       </w:rPr>
     </w:lvl>
   </w:abstractNum>
-  <w:abstractNum w:abstractNumId="12" w15:restartNumberingAfterBreak="0">
+  <w:abstractNum w:abstractNumId="13" w15:restartNumberingAfterBreak="0">
     <w:nsid w:val="037669EE"/>
     <w:multiLevelType w:val="multilevel"/>
     <w:tmpl w:val="100C0021"/>
@@ -2826,7 +3275,7 @@
       </w:rPr>
     </w:lvl>
   </w:abstractNum>
-  <w:abstractNum w:abstractNumId="13" w15:restartNumberingAfterBreak="0">
+  <w:abstractNum w:abstractNumId="14" w15:restartNumberingAfterBreak="0">
     <w:nsid w:val="06482CAE"/>
     <w:multiLevelType w:val="multilevel"/>
     <w:tmpl w:val="100C0021"/>
@@ -2939,7 +3388,7 @@
       </w:rPr>
     </w:lvl>
   </w:abstractNum>
-  <w:abstractNum w:abstractNumId="14" w15:restartNumberingAfterBreak="0">
+  <w:abstractNum w:abstractNumId="15" w15:restartNumberingAfterBreak="0">
     <w:nsid w:val="067320D8"/>
     <w:multiLevelType w:val="multilevel"/>
     <w:tmpl w:val="100C0021"/>
@@ -3052,7 +3501,7 @@
       </w:rPr>
     </w:lvl>
   </w:abstractNum>
-  <w:abstractNum w:abstractNumId="15" w15:restartNumberingAfterBreak="0">
+  <w:abstractNum w:abstractNumId="16" w15:restartNumberingAfterBreak="0">
     <w:nsid w:val="0A7C7405"/>
     <w:multiLevelType w:val="singleLevel"/>
     <w:tmpl w:val="92869324"/>
@@ -3073,7 +3522,7 @@
       </w:rPr>
     </w:lvl>
   </w:abstractNum>
-  <w:abstractNum w:abstractNumId="16" w15:restartNumberingAfterBreak="0">
+  <w:abstractNum w:abstractNumId="17" w15:restartNumberingAfterBreak="0">
     <w:nsid w:val="100D77BA"/>
     <w:multiLevelType w:val="hybridMultilevel"/>
     <w:tmpl w:val="B8147694"/>
@@ -3186,7 +3635,7 @@
       </w:rPr>
     </w:lvl>
   </w:abstractNum>
-  <w:abstractNum w:abstractNumId="17" w15:restartNumberingAfterBreak="0">
+  <w:abstractNum w:abstractNumId="18" w15:restartNumberingAfterBreak="0">
     <w:nsid w:val="13386E8A"/>
     <w:multiLevelType w:val="multilevel"/>
     <w:tmpl w:val="100C0021"/>
@@ -3299,7 +3748,7 @@
       </w:rPr>
     </w:lvl>
   </w:abstractNum>
-  <w:abstractNum w:abstractNumId="18" w15:restartNumberingAfterBreak="0">
+  <w:abstractNum w:abstractNumId="19" w15:restartNumberingAfterBreak="0">
     <w:nsid w:val="13AB381A"/>
     <w:multiLevelType w:val="hybridMultilevel"/>
     <w:tmpl w:val="B43857E8"/>
@@ -3442,7 +3891,7 @@
       </w:rPr>
     </w:lvl>
   </w:abstractNum>
-  <w:abstractNum w:abstractNumId="19" w15:restartNumberingAfterBreak="0">
+  <w:abstractNum w:abstractNumId="20" w15:restartNumberingAfterBreak="0">
     <w:nsid w:val="20CB35C8"/>
     <w:multiLevelType w:val="hybridMultilevel"/>
     <w:tmpl w:val="2AA2EA56"/>
@@ -3555,10 +4004,10 @@
       </w:rPr>
     </w:lvl>
   </w:abstractNum>
-  <w:abstractNum w:abstractNumId="20" w15:restartNumberingAfterBreak="0">
+  <w:abstractNum w:abstractNumId="21" w15:restartNumberingAfterBreak="0">
     <w:nsid w:val="2A8F67FD"/>
     <w:multiLevelType w:val="multilevel"/>
-    <w:tmpl w:val="2FDECA9C"/>
+    <w:tmpl w:val="84D8E5E0"/>
     <w:lvl w:ilvl="0">
       <w:start w:val="1"/>
       <w:numFmt w:val="decimal"/>
@@ -3698,7 +4147,7 @@
       </w:rPr>
     </w:lvl>
   </w:abstractNum>
-  <w:abstractNum w:abstractNumId="21" w15:restartNumberingAfterBreak="0">
+  <w:abstractNum w:abstractNumId="22" w15:restartNumberingAfterBreak="0">
     <w:nsid w:val="2F2C5963"/>
     <w:multiLevelType w:val="multilevel"/>
     <w:tmpl w:val="E2569098"/>
@@ -3811,7 +4260,7 @@
       </w:pPr>
     </w:lvl>
   </w:abstractNum>
-  <w:abstractNum w:abstractNumId="22" w15:restartNumberingAfterBreak="0">
+  <w:abstractNum w:abstractNumId="23" w15:restartNumberingAfterBreak="0">
     <w:nsid w:val="36506853"/>
     <w:multiLevelType w:val="multilevel"/>
     <w:tmpl w:val="2F6EF210"/>
@@ -3924,7 +4373,7 @@
       </w:rPr>
     </w:lvl>
   </w:abstractNum>
-  <w:abstractNum w:abstractNumId="23" w15:restartNumberingAfterBreak="0">
+  <w:abstractNum w:abstractNumId="24" w15:restartNumberingAfterBreak="0">
     <w:nsid w:val="3BD16F36"/>
     <w:multiLevelType w:val="multilevel"/>
     <w:tmpl w:val="100C0021"/>
@@ -4037,7 +4486,7 @@
       </w:rPr>
     </w:lvl>
   </w:abstractNum>
-  <w:abstractNum w:abstractNumId="24" w15:restartNumberingAfterBreak="0">
+  <w:abstractNum w:abstractNumId="25" w15:restartNumberingAfterBreak="0">
     <w:nsid w:val="3C361DED"/>
     <w:multiLevelType w:val="multilevel"/>
     <w:tmpl w:val="100C0021"/>
@@ -4150,7 +4599,7 @@
       </w:rPr>
     </w:lvl>
   </w:abstractNum>
-  <w:abstractNum w:abstractNumId="25" w15:restartNumberingAfterBreak="0">
+  <w:abstractNum w:abstractNumId="26" w15:restartNumberingAfterBreak="0">
     <w:nsid w:val="3EF922F0"/>
     <w:multiLevelType w:val="multilevel"/>
     <w:tmpl w:val="100C0021"/>
@@ -4263,7 +4712,7 @@
       </w:rPr>
     </w:lvl>
   </w:abstractNum>
-  <w:abstractNum w:abstractNumId="26" w15:restartNumberingAfterBreak="0">
+  <w:abstractNum w:abstractNumId="27" w15:restartNumberingAfterBreak="0">
     <w:nsid w:val="486164F4"/>
     <w:multiLevelType w:val="multilevel"/>
     <w:tmpl w:val="100C0021"/>
@@ -4376,7 +4825,7 @@
       </w:rPr>
     </w:lvl>
   </w:abstractNum>
-  <w:abstractNum w:abstractNumId="27" w15:restartNumberingAfterBreak="0">
+  <w:abstractNum w:abstractNumId="28" w15:restartNumberingAfterBreak="0">
     <w:nsid w:val="4C4E14AC"/>
     <w:multiLevelType w:val="multilevel"/>
     <w:tmpl w:val="100C001F"/>
@@ -4462,7 +4911,7 @@
       </w:pPr>
     </w:lvl>
   </w:abstractNum>
-  <w:abstractNum w:abstractNumId="28" w15:restartNumberingAfterBreak="0">
+  <w:abstractNum w:abstractNumId="29" w15:restartNumberingAfterBreak="0">
     <w:nsid w:val="4D30734E"/>
     <w:multiLevelType w:val="multilevel"/>
     <w:tmpl w:val="100C001D"/>
@@ -4548,7 +4997,7 @@
       </w:pPr>
     </w:lvl>
   </w:abstractNum>
-  <w:abstractNum w:abstractNumId="29" w15:restartNumberingAfterBreak="0">
+  <w:abstractNum w:abstractNumId="30" w15:restartNumberingAfterBreak="0">
     <w:nsid w:val="55FE2729"/>
     <w:multiLevelType w:val="multilevel"/>
     <w:tmpl w:val="100C0023"/>
@@ -4635,7 +5084,7 @@
       </w:pPr>
     </w:lvl>
   </w:abstractNum>
-  <w:abstractNum w:abstractNumId="30" w15:restartNumberingAfterBreak="0">
+  <w:abstractNum w:abstractNumId="31" w15:restartNumberingAfterBreak="0">
     <w:nsid w:val="58933B2A"/>
     <w:multiLevelType w:val="multilevel"/>
     <w:tmpl w:val="100C0021"/>
@@ -4748,7 +5197,7 @@
       </w:rPr>
     </w:lvl>
   </w:abstractNum>
-  <w:abstractNum w:abstractNumId="31" w15:restartNumberingAfterBreak="0">
+  <w:abstractNum w:abstractNumId="32" w15:restartNumberingAfterBreak="0">
     <w:nsid w:val="5C877673"/>
     <w:multiLevelType w:val="multilevel"/>
     <w:tmpl w:val="100C0021"/>
@@ -4861,7 +5310,7 @@
       </w:rPr>
     </w:lvl>
   </w:abstractNum>
-  <w:abstractNum w:abstractNumId="32" w15:restartNumberingAfterBreak="0">
+  <w:abstractNum w:abstractNumId="33" w15:restartNumberingAfterBreak="0">
     <w:nsid w:val="5CBC53EC"/>
     <w:multiLevelType w:val="multilevel"/>
     <w:tmpl w:val="2F6EF210"/>
@@ -4974,7 +5423,7 @@
       </w:rPr>
     </w:lvl>
   </w:abstractNum>
-  <w:abstractNum w:abstractNumId="33" w15:restartNumberingAfterBreak="0">
+  <w:abstractNum w:abstractNumId="34" w15:restartNumberingAfterBreak="0">
     <w:nsid w:val="5E424682"/>
     <w:multiLevelType w:val="multilevel"/>
     <w:tmpl w:val="100C001F"/>
@@ -5060,7 +5509,7 @@
       </w:pPr>
     </w:lvl>
   </w:abstractNum>
-  <w:abstractNum w:abstractNumId="34" w15:restartNumberingAfterBreak="0">
+  <w:abstractNum w:abstractNumId="35" w15:restartNumberingAfterBreak="0">
     <w:nsid w:val="63A9062F"/>
     <w:multiLevelType w:val="multilevel"/>
     <w:tmpl w:val="DCCE794A"/>
@@ -5200,7 +5649,7 @@
       </w:rPr>
     </w:lvl>
   </w:abstractNum>
-  <w:abstractNum w:abstractNumId="35" w15:restartNumberingAfterBreak="0">
+  <w:abstractNum w:abstractNumId="36" w15:restartNumberingAfterBreak="0">
     <w:nsid w:val="643F0961"/>
     <w:multiLevelType w:val="multilevel"/>
     <w:tmpl w:val="100C0021"/>
@@ -5313,7 +5762,7 @@
       </w:rPr>
     </w:lvl>
   </w:abstractNum>
-  <w:abstractNum w:abstractNumId="36" w15:restartNumberingAfterBreak="0">
+  <w:abstractNum w:abstractNumId="37" w15:restartNumberingAfterBreak="0">
     <w:nsid w:val="6D6476B9"/>
     <w:multiLevelType w:val="multilevel"/>
     <w:tmpl w:val="100C0023"/>
@@ -5400,7 +5849,7 @@
       </w:pPr>
     </w:lvl>
   </w:abstractNum>
-  <w:abstractNum w:abstractNumId="37" w15:restartNumberingAfterBreak="0">
+  <w:abstractNum w:abstractNumId="38" w15:restartNumberingAfterBreak="0">
     <w:nsid w:val="70C03573"/>
     <w:multiLevelType w:val="multilevel"/>
     <w:tmpl w:val="100C0021"/>
@@ -5513,7 +5962,7 @@
       </w:rPr>
     </w:lvl>
   </w:abstractNum>
-  <w:abstractNum w:abstractNumId="38" w15:restartNumberingAfterBreak="0">
+  <w:abstractNum w:abstractNumId="39" w15:restartNumberingAfterBreak="0">
     <w:nsid w:val="79CD09A9"/>
     <w:multiLevelType w:val="multilevel"/>
     <w:tmpl w:val="100C0021"/>
@@ -5626,7 +6075,7 @@
       </w:rPr>
     </w:lvl>
   </w:abstractNum>
-  <w:abstractNum w:abstractNumId="39" w15:restartNumberingAfterBreak="0">
+  <w:abstractNum w:abstractNumId="40" w15:restartNumberingAfterBreak="0">
     <w:nsid w:val="7E7F1C51"/>
     <w:multiLevelType w:val="multilevel"/>
     <w:tmpl w:val="100C0021"/>
@@ -5740,97 +6189,97 @@
     </w:lvl>
   </w:abstractNum>
   <w:num w:numId="1" w16cid:durableId="2145997964">
-    <w:abstractNumId w:val="11"/>
+    <w:abstractNumId w:val="12"/>
   </w:num>
   <w:num w:numId="2" w16cid:durableId="107621841">
-    <w:abstractNumId w:val="18"/>
+    <w:abstractNumId w:val="19"/>
   </w:num>
   <w:num w:numId="3" w16cid:durableId="1449399550">
-    <w:abstractNumId w:val="15"/>
+    <w:abstractNumId w:val="16"/>
   </w:num>
   <w:num w:numId="4" w16cid:durableId="1128206706">
-    <w:abstractNumId w:val="34"/>
+    <w:abstractNumId w:val="35"/>
   </w:num>
   <w:num w:numId="5" w16cid:durableId="191919268">
-    <w:abstractNumId w:val="34"/>
+    <w:abstractNumId w:val="35"/>
   </w:num>
   <w:num w:numId="6" w16cid:durableId="449400602">
-    <w:abstractNumId w:val="15"/>
+    <w:abstractNumId w:val="16"/>
   </w:num>
   <w:num w:numId="7" w16cid:durableId="1978603006">
-    <w:abstractNumId w:val="15"/>
+    <w:abstractNumId w:val="16"/>
   </w:num>
   <w:num w:numId="8" w16cid:durableId="98568349">
-    <w:abstractNumId w:val="15"/>
+    <w:abstractNumId w:val="16"/>
   </w:num>
   <w:num w:numId="9" w16cid:durableId="1521775669">
-    <w:abstractNumId w:val="15"/>
+    <w:abstractNumId w:val="16"/>
   </w:num>
   <w:num w:numId="10" w16cid:durableId="817575104">
-    <w:abstractNumId w:val="34"/>
+    <w:abstractNumId w:val="35"/>
   </w:num>
   <w:num w:numId="11" w16cid:durableId="1794010489">
-    <w:abstractNumId w:val="15"/>
+    <w:abstractNumId w:val="16"/>
   </w:num>
   <w:num w:numId="12" w16cid:durableId="65077810">
+    <w:abstractNumId w:val="22"/>
+  </w:num>
+  <w:num w:numId="13" w16cid:durableId="2075738844">
     <w:abstractNumId w:val="21"/>
   </w:num>
-  <w:num w:numId="13" w16cid:durableId="2075738844">
+  <w:num w:numId="14" w16cid:durableId="164058343">
     <w:abstractNumId w:val="20"/>
   </w:num>
-  <w:num w:numId="14" w16cid:durableId="164058343">
-    <w:abstractNumId w:val="19"/>
-  </w:num>
   <w:num w:numId="15" w16cid:durableId="1471245564">
-    <w:abstractNumId w:val="16"/>
+    <w:abstractNumId w:val="17"/>
   </w:num>
   <w:num w:numId="16" w16cid:durableId="499664066">
-    <w:abstractNumId w:val="31"/>
+    <w:abstractNumId w:val="32"/>
   </w:num>
   <w:num w:numId="17" w16cid:durableId="406802497">
-    <w:abstractNumId w:val="26"/>
+    <w:abstractNumId w:val="27"/>
   </w:num>
   <w:num w:numId="18" w16cid:durableId="632560430">
-    <w:abstractNumId w:val="39"/>
+    <w:abstractNumId w:val="40"/>
   </w:num>
   <w:num w:numId="19" w16cid:durableId="1536770261">
-    <w:abstractNumId w:val="37"/>
+    <w:abstractNumId w:val="38"/>
   </w:num>
   <w:num w:numId="20" w16cid:durableId="484863358">
     <w:abstractNumId w:val="10"/>
   </w:num>
   <w:num w:numId="21" w16cid:durableId="1011448673">
-    <w:abstractNumId w:val="35"/>
+    <w:abstractNumId w:val="36"/>
   </w:num>
   <w:num w:numId="22" w16cid:durableId="137040473">
-    <w:abstractNumId w:val="25"/>
+    <w:abstractNumId w:val="26"/>
   </w:num>
   <w:num w:numId="23" w16cid:durableId="821626520">
-    <w:abstractNumId w:val="23"/>
+    <w:abstractNumId w:val="24"/>
   </w:num>
   <w:num w:numId="24" w16cid:durableId="273024467">
+    <w:abstractNumId w:val="14"/>
+  </w:num>
+  <w:num w:numId="25" w16cid:durableId="919366405">
+    <w:abstractNumId w:val="18"/>
+  </w:num>
+  <w:num w:numId="26" w16cid:durableId="1462113721">
     <w:abstractNumId w:val="13"/>
   </w:num>
-  <w:num w:numId="25" w16cid:durableId="919366405">
-    <w:abstractNumId w:val="17"/>
+  <w:num w:numId="27" w16cid:durableId="934367317">
+    <w:abstractNumId w:val="31"/>
   </w:num>
-  <w:num w:numId="26" w16cid:durableId="1462113721">
-    <w:abstractNumId w:val="12"/>
+  <w:num w:numId="28" w16cid:durableId="1126698692">
+    <w:abstractNumId w:val="34"/>
   </w:num>
-  <w:num w:numId="27" w16cid:durableId="934367317">
+  <w:num w:numId="29" w16cid:durableId="1675304407">
+    <w:abstractNumId w:val="29"/>
+  </w:num>
+  <w:num w:numId="30" w16cid:durableId="229773398">
     <w:abstractNumId w:val="30"/>
   </w:num>
-  <w:num w:numId="28" w16cid:durableId="1126698692">
-    <w:abstractNumId w:val="33"/>
-  </w:num>
-  <w:num w:numId="29" w16cid:durableId="1675304407">
-    <w:abstractNumId w:val="28"/>
-  </w:num>
-  <w:num w:numId="30" w16cid:durableId="229773398">
-    <w:abstractNumId w:val="29"/>
-  </w:num>
   <w:num w:numId="31" w16cid:durableId="270552136">
-    <w:abstractNumId w:val="36"/>
+    <w:abstractNumId w:val="37"/>
   </w:num>
   <w:num w:numId="32" w16cid:durableId="120925093">
     <w:abstractNumId w:val="8"/>
@@ -5863,22 +6312,25 @@
     <w:abstractNumId w:val="4"/>
   </w:num>
   <w:num w:numId="42" w16cid:durableId="2126659192">
-    <w:abstractNumId w:val="27"/>
+    <w:abstractNumId w:val="28"/>
   </w:num>
   <w:num w:numId="43" w16cid:durableId="348290950">
-    <w:abstractNumId w:val="24"/>
+    <w:abstractNumId w:val="25"/>
   </w:num>
   <w:num w:numId="44" w16cid:durableId="722481345">
-    <w:abstractNumId w:val="38"/>
+    <w:abstractNumId w:val="39"/>
   </w:num>
   <w:num w:numId="45" w16cid:durableId="1772430321">
-    <w:abstractNumId w:val="14"/>
+    <w:abstractNumId w:val="15"/>
   </w:num>
   <w:num w:numId="46" w16cid:durableId="1519343925">
-    <w:abstractNumId w:val="22"/>
+    <w:abstractNumId w:val="23"/>
   </w:num>
   <w:num w:numId="47" w16cid:durableId="1397777875">
-    <w:abstractNumId w:val="32"/>
+    <w:abstractNumId w:val="33"/>
+  </w:num>
+  <w:num w:numId="48" w16cid:durableId="921371040">
+    <w:abstractNumId w:val="11"/>
   </w:num>
   <w:numIdMacAtCleanup w:val="4"/>
 </w:numbering>
@@ -6269,9 +6721,9 @@
   <w:style w:type="paragraph" w:default="1" w:styleId="Normal">
     <w:name w:val="Normal"/>
     <w:qFormat/>
-    <w:rsid w:val="00413D92"/>
+    <w:rsid w:val="00DD18B5"/>
     <w:pPr>
-      <w:spacing w:after="160"/>
+      <w:spacing w:after="160" w:line="276" w:lineRule="auto"/>
     </w:pPr>
     <w:rPr>
       <w:rFonts w:ascii="Century Gothic" w:eastAsia="Aptos" w:hAnsi="Century Gothic"/>
@@ -6313,7 +6765,7 @@
     <w:next w:val="Retraitcorpsdetexte"/>
     <w:autoRedefine/>
     <w:qFormat/>
-    <w:rsid w:val="00AA4393"/>
+    <w:rsid w:val="00D83EAC"/>
     <w:pPr>
       <w:keepNext/>
       <w:numPr>
@@ -6328,8 +6780,8 @@
       <w:b/>
       <w:bCs/>
       <w:iCs/>
-      <w:sz w:val="28"/>
-      <w:szCs w:val="28"/>
+      <w:sz w:val="24"/>
+      <w:szCs w:val="24"/>
     </w:rPr>
   </w:style>
   <w:style w:type="paragraph" w:styleId="Titre3">
@@ -6477,7 +6929,6 @@
   <w:style w:type="character" w:default="1" w:styleId="Policepardfaut">
     <w:name w:val="Default Paragraph Font"/>
     <w:uiPriority w:val="1"/>
-    <w:semiHidden/>
     <w:unhideWhenUsed/>
   </w:style>
   <w:style w:type="table" w:default="1" w:styleId="TableauNormal">
@@ -6528,7 +6979,6 @@
   <w:style w:type="table" w:styleId="Grilledutableau">
     <w:name w:val="Table Grid"/>
     <w:basedOn w:val="TableauNormal"/>
-    <w:semiHidden/>
     <w:rsid w:val="00AE282D"/>
     <w:tblPr>
       <w:tblBorders>
@@ -7058,6 +7508,18 @@
       <w:lang w:eastAsia="fr-CH"/>
     </w:rPr>
   </w:style>
+  <w:style w:type="character" w:styleId="Mentionnonrsolue">
+    <w:name w:val="Unresolved Mention"/>
+    <w:basedOn w:val="Policepardfaut"/>
+    <w:uiPriority w:val="99"/>
+    <w:semiHidden/>
+    <w:unhideWhenUsed/>
+    <w:rsid w:val="00DC7FDC"/>
+    <w:rPr>
+      <w:color w:val="605E5C"/>
+      <w:shd w:val="clear" w:color="auto" w:fill="E1DFDD"/>
+    </w:rPr>
+  </w:style>
 </w:styles>
 </file>
 
@@ -7348,15 +7810,6 @@
 </file>
 
 <file path=customXml/item1.xml><?xml version="1.0" encoding="utf-8"?>
-<?mso-contentType ?>
-<FormTemplates xmlns="http://schemas.microsoft.com/sharepoint/v3/contenttype/forms">
-  <Display>DocumentLibraryForm</Display>
-  <Edit>DocumentLibraryForm</Edit>
-  <New>DocumentLibraryForm</New>
-</FormTemplates>
-</file>
-
-<file path=customXml/item2.xml><?xml version="1.0" encoding="utf-8"?>
 <p:properties xmlns:p="http://schemas.microsoft.com/office/2006/metadata/properties" xmlns:xsi="http://www.w3.org/2001/XMLSchema-instance" xmlns:pc="http://schemas.microsoft.com/office/infopath/2007/PartnerControls">
   <documentManagement>
     <lcf76f155ced4ddcb4097134ff3c332f xmlns="a1b10758-7132-46a4-a2fe-7a2cf46f51f4">
@@ -7367,11 +7820,16 @@
 </p:properties>
 </file>
 
-<file path=customXml/item3.xml><?xml version="1.0" encoding="utf-8"?>
-<b:Sources xmlns:b="http://schemas.openxmlformats.org/officeDocument/2006/bibliography" xmlns="http://schemas.openxmlformats.org/officeDocument/2006/bibliography" SelectedStyle="\APA.XSL" StyleName="APA"/>
+<file path=customXml/item2.xml><?xml version="1.0" encoding="utf-8"?>
+<?mso-contentType ?>
+<FormTemplates xmlns="http://schemas.microsoft.com/sharepoint/v3/contenttype/forms">
+  <Display>DocumentLibraryForm</Display>
+  <Edit>DocumentLibraryForm</Edit>
+  <New>DocumentLibraryForm</New>
+</FormTemplates>
 </file>
 
-<file path=customXml/item4.xml><?xml version="1.0" encoding="utf-8"?>
+<file path=customXml/item3.xml><?xml version="1.0" encoding="utf-8"?>
 <ct:contentTypeSchema xmlns:ct="http://schemas.microsoft.com/office/2006/metadata/contentType" xmlns:ma="http://schemas.microsoft.com/office/2006/metadata/properties/metaAttributes" ct:_="" ma:_="" ma:contentTypeName="Document" ma:contentTypeID="0x0101005A5B8F5EAAC22C48A11F5D9A60E6F21D" ma:contentTypeVersion="16" ma:contentTypeDescription="Crée un document." ma:contentTypeScope="" ma:versionID="f2b963976306cc54294b7f4545a3c6c4">
   <xsd:schema xmlns:xsd="http://www.w3.org/2001/XMLSchema" xmlns:xs="http://www.w3.org/2001/XMLSchema" xmlns:p="http://schemas.microsoft.com/office/2006/metadata/properties" xmlns:ns2="a1b10758-7132-46a4-a2fe-7a2cf46f51f4" xmlns:ns3="f7d9f5a6-831d-4621-8c77-cbcaf993e406" targetNamespace="http://schemas.microsoft.com/office/2006/metadata/properties" ma:root="true" ma:fieldsID="e5e135fa2fc1295e1586ddcd9c1a8904" ns2:_="" ns3:_="">
     <xsd:import namespace="a1b10758-7132-46a4-a2fe-7a2cf46f51f4"/>
@@ -7614,15 +8072,11 @@
 </ct:contentTypeSchema>
 </file>
 
-<file path=customXml/itemProps1.xml><?xml version="1.0" encoding="utf-8"?>
-<ds:datastoreItem xmlns:ds="http://schemas.openxmlformats.org/officeDocument/2006/customXml" ds:itemID="{6C3F7A66-EDE3-46FD-83EB-3C265E5D2669}">
-  <ds:schemaRefs>
-    <ds:schemaRef ds:uri="http://schemas.microsoft.com/sharepoint/v3/contenttype/forms"/>
-  </ds:schemaRefs>
-</ds:datastoreItem>
+<file path=customXml/item4.xml><?xml version="1.0" encoding="utf-8"?>
+<b:Sources xmlns:b="http://schemas.openxmlformats.org/officeDocument/2006/bibliography" xmlns="http://schemas.openxmlformats.org/officeDocument/2006/bibliography" SelectedStyle="\APA.XSL" StyleName="APA"/>
 </file>
 
-<file path=customXml/itemProps2.xml><?xml version="1.0" encoding="utf-8"?>
+<file path=customXml/itemProps1.xml><?xml version="1.0" encoding="utf-8"?>
 <ds:datastoreItem xmlns:ds="http://schemas.openxmlformats.org/officeDocument/2006/customXml" ds:itemID="{2319CDB8-A2CD-412D-8359-13E6B4DF1FF4}">
   <ds:schemaRefs>
     <ds:schemaRef ds:uri="http://schemas.microsoft.com/office/2006/metadata/properties"/>
@@ -7633,15 +8087,15 @@
 </ds:datastoreItem>
 </file>
 
-<file path=customXml/itemProps3.xml><?xml version="1.0" encoding="utf-8"?>
-<ds:datastoreItem xmlns:ds="http://schemas.openxmlformats.org/officeDocument/2006/customXml" ds:itemID="{568921BA-CD18-4CDB-89DC-F2A18476564E}">
+<file path=customXml/itemProps2.xml><?xml version="1.0" encoding="utf-8"?>
+<ds:datastoreItem xmlns:ds="http://schemas.openxmlformats.org/officeDocument/2006/customXml" ds:itemID="{6C3F7A66-EDE3-46FD-83EB-3C265E5D2669}">
   <ds:schemaRefs>
-    <ds:schemaRef ds:uri="http://schemas.openxmlformats.org/officeDocument/2006/bibliography"/>
+    <ds:schemaRef ds:uri="http://schemas.microsoft.com/sharepoint/v3/contenttype/forms"/>
   </ds:schemaRefs>
 </ds:datastoreItem>
 </file>
 
-<file path=customXml/itemProps4.xml><?xml version="1.0" encoding="utf-8"?>
+<file path=customXml/itemProps3.xml><?xml version="1.0" encoding="utf-8"?>
 <ds:datastoreItem xmlns:ds="http://schemas.openxmlformats.org/officeDocument/2006/customXml" ds:itemID="{41546E4A-837A-4BEF-A4B8-FFD4EAB4E855}">
   <ds:schemaRefs>
     <ds:schemaRef ds:uri="http://schemas.microsoft.com/office/2006/metadata/contentType"/>
@@ -7658,4 +8112,12 @@
     <ds:schemaRef ds:uri="http://schemas.microsoft.com/internal/obd"/>
   </ds:schemaRefs>
 </ds:datastoreItem>
+</file>
+
+<file path=customXml/itemProps4.xml><?xml version="1.0" encoding="utf-8"?>
+<ds:datastoreItem xmlns:ds="http://schemas.openxmlformats.org/officeDocument/2006/customXml" ds:itemID="{568921BA-CD18-4CDB-89DC-F2A18476564E}">
+  <ds:schemaRefs>
+    <ds:schemaRef ds:uri="http://schemas.openxmlformats.org/officeDocument/2006/bibliography"/>
+  </ds:schemaRefs>
+</ds:datastoreItem>
 </file>
</xml_diff>

<commit_message>
doc(liens des sites visités) : ajout de liens
[5][Done]
</commit_message>
<xml_diff>
--- a/doc/R-P_Web294-Rapport.docx
+++ b/doc/R-P_Web294-Rapport.docx
@@ -83,21 +83,35 @@
         <w:rPr>
           <w:lang w:val="en-US"/>
         </w:rPr>
-        <w:t xml:space="preserve">Jonathan </w:t>
+        <w:t xml:space="preserve">Jonathan Junod et </w:t>
       </w:r>
       <w:proofErr w:type="spellStart"/>
       <w:r>
         <w:rPr>
           <w:lang w:val="en-US"/>
         </w:rPr>
-        <w:t>Junod</w:t>
+        <w:t>Néo</w:t>
       </w:r>
       <w:proofErr w:type="spellEnd"/>
       <w:r>
         <w:rPr>
           <w:lang w:val="en-US"/>
         </w:rPr>
-        <w:t xml:space="preserve"> et Néo Darbellay, CID/MID</w:t>
+        <w:t xml:space="preserve"> </w:t>
+      </w:r>
+      <w:proofErr w:type="spellStart"/>
+      <w:r>
+        <w:rPr>
+          <w:lang w:val="en-US"/>
+        </w:rPr>
+        <w:t>Darbellay</w:t>
+      </w:r>
+      <w:proofErr w:type="spellEnd"/>
+      <w:r>
+        <w:rPr>
+          <w:lang w:val="en-US"/>
+        </w:rPr>
+        <w:t>, CID/MID</w:t>
       </w:r>
       <w:r>
         <w:rPr>
@@ -1436,7 +1450,11 @@
         <w:jc w:val="left"/>
       </w:pPr>
       <w:r>
-        <w:t>Dans le cadre du module 294, il nous a été demandé de mettre en pratique les compétences acquises en développant le frontend d'une application web complète. Le projet « Passion Lecture » est un projet qui a pour objectif de créer une plateforme permettant aux utilisateurs de partager et de découvrir des ouvrages littéraires. Cette application a été développée selon une approche moderne et intuitive, avec l'utilisation de Vue.js et Vue Routeur pour l'interface. Le volet des données est géré par My</w:t>
+        <w:t xml:space="preserve">Dans le cadre du module 294, il nous a été demandé de mettre en pratique les compétences acquises en développant le frontend d'une application web complète. Le projet « Passion Lecture » est un projet qui a pour objectif de créer une plateforme permettant aux utilisateurs de partager et de découvrir des ouvrages littéraires. Cette application a été développée selon une approche moderne et intuitive, avec l'utilisation de Vue.js et Vue Routeur pour l'interface. Le volet des données est géré par </w:t>
+      </w:r>
+      <w:proofErr w:type="spellStart"/>
+      <w:r>
+        <w:t>My</w:t>
       </w:r>
       <w:r>
         <w:t>J</w:t>
@@ -1448,7 +1466,11 @@
         <w:t>S</w:t>
       </w:r>
       <w:r>
-        <w:t xml:space="preserve">erver, qui assure le rôle de </w:t>
+        <w:t>erver</w:t>
+      </w:r>
+      <w:proofErr w:type="spellEnd"/>
+      <w:r>
+        <w:t xml:space="preserve">, qui assure le rôle de </w:t>
       </w:r>
       <w:r>
         <w:t>backend</w:t>
@@ -1774,14 +1796,14 @@
       <w:pPr>
         <w:pStyle w:val="Titre2"/>
       </w:pPr>
-      <w:bookmarkStart w:id="12" w:name="_Toc532179960"/>
-      <w:bookmarkStart w:id="13" w:name="_Toc165969644"/>
-      <w:bookmarkStart w:id="14" w:name="_Toc308526339"/>
-      <w:bookmarkStart w:id="15" w:name="_Toc223450329"/>
+      <w:bookmarkStart w:id="12" w:name="_Toc223450329"/>
+      <w:bookmarkStart w:id="13" w:name="_Toc532179960"/>
+      <w:bookmarkStart w:id="14" w:name="_Toc165969644"/>
+      <w:bookmarkStart w:id="15" w:name="_Toc308526339"/>
       <w:r>
         <w:t>Fonctionnalités technique demandées</w:t>
       </w:r>
-      <w:bookmarkEnd w:id="15"/>
+      <w:bookmarkEnd w:id="12"/>
     </w:p>
     <w:p>
       <w:pPr>
@@ -1798,9 +1820,9 @@
         <w:pStyle w:val="Titre2"/>
       </w:pPr>
       <w:bookmarkStart w:id="16" w:name="_Toc223450330"/>
-      <w:bookmarkEnd w:id="12"/>
       <w:bookmarkEnd w:id="13"/>
       <w:bookmarkEnd w:id="14"/>
+      <w:bookmarkEnd w:id="15"/>
       <w:r>
         <w:t xml:space="preserve">Organisation de la gestion du code avec </w:t>
       </w:r>
@@ -1985,6 +2007,11 @@
           <w:ilvl w:val="0"/>
           <w:numId w:val="48"/>
         </w:numPr>
+        <w:rPr>
+          <w:rStyle w:val="Lienhypertexte"/>
+          <w:color w:val="auto"/>
+          <w:u w:val="none"/>
+        </w:rPr>
       </w:pPr>
       <w:hyperlink r:id="rId16" w:history="1">
         <w:r>
@@ -1998,11 +2025,50 @@
     <w:p>
       <w:pPr>
         <w:pStyle w:val="Corpsdetexte"/>
+        <w:numPr>
+          <w:ilvl w:val="0"/>
+          <w:numId w:val="48"/>
+        </w:numPr>
+        <w:rPr>
+          <w:rStyle w:val="Lienhypertexte"/>
+          <w:color w:val="auto"/>
+          <w:u w:val="none"/>
+        </w:rPr>
+      </w:pPr>
+      <w:hyperlink r:id="rId17" w:history="1">
+        <w:r>
+          <w:rPr>
+            <w:rStyle w:val="Lienhypertexte"/>
+          </w:rPr>
+          <w:t>https://strapi.io/blog/yup-validation-in-react-hook-form-a-complete-guide-with-examples</w:t>
+        </w:r>
+      </w:hyperlink>
+    </w:p>
+    <w:p>
+      <w:pPr>
+        <w:pStyle w:val="Corpsdetexte"/>
+        <w:numPr>
+          <w:ilvl w:val="0"/>
+          <w:numId w:val="48"/>
+        </w:numPr>
+      </w:pPr>
+      <w:hyperlink r:id="rId18" w:history="1">
+        <w:r>
+          <w:rPr>
+            <w:rStyle w:val="Lienhypertexte"/>
+          </w:rPr>
+          <w:t>https://stackoverflow.com/questions/61634973/yup-validation-of-website-using-url-very-strict</w:t>
+        </w:r>
+      </w:hyperlink>
+    </w:p>
+    <w:p>
+      <w:pPr>
+        <w:pStyle w:val="Corpsdetexte"/>
       </w:pPr>
     </w:p>
     <w:sectPr>
-      <w:headerReference w:type="default" r:id="rId17"/>
-      <w:footerReference w:type="default" r:id="rId18"/>
+      <w:headerReference w:type="default" r:id="rId19"/>
+      <w:footerReference w:type="default" r:id="rId20"/>
       <w:pgSz w:w="11906" w:h="16838" w:code="9"/>
       <w:pgMar w:top="1418" w:right="1418" w:bottom="1418" w:left="1418" w:header="709" w:footer="709" w:gutter="0"/>
       <w:cols w:space="708"/>
@@ -2378,7 +2444,7 @@
             <w:rPr>
               <w:noProof/>
             </w:rPr>
-            <w:t>03.03.2026 17:19</w:t>
+            <w:t>04.03.2026 08:57</w:t>
           </w:r>
           <w:r>
             <w:fldChar w:fldCharType="end"/>
@@ -2601,7 +2667,7 @@
         <v:path o:extrusionok="f" gradientshapeok="t" o:connecttype="rect"/>
         <o:lock v:ext="edit" aspectratio="t"/>
       </v:shapetype>
-      <v:shape id="_x0000_i1067" type="#_x0000_t75" style="width:11.35pt;height:11.35pt" o:bullet="t">
+      <v:shape id="_x0000_i1035" type="#_x0000_t75" style="width:11.25pt;height:11.25pt" o:bullet="t">
         <v:imagedata r:id="rId1" o:title="BD10263_"/>
       </v:shape>
     </w:pict>

</xml_diff>